<commit_message>
update the sward notes
</commit_message>
<xml_diff>
--- a/SWARD/Lectures/Lecture 1.docx
+++ b/SWARD/Lectures/Lecture 1.docx
@@ -147,23 +147,66 @@
           <w:sz w:val="22"/>
           <w:szCs w:val="22"/>
         </w:rPr>
+        <w:t>B</w:t>
+      </w:r>
+      <w:r>
+        <w:rPr>
+          <w:color w:val="000000" w:themeColor="text1"/>
+          <w:sz w:val="22"/>
+          <w:szCs w:val="22"/>
+        </w:rPr>
+        <w:t>efore</w:t>
+      </w:r>
+      <w:r>
+        <w:rPr>
+          <w:color w:val="000000" w:themeColor="text1"/>
+          <w:sz w:val="22"/>
+          <w:szCs w:val="22"/>
+        </w:rPr>
+        <w:sym w:font="Wingdings" w:char="F0E0"/>
+      </w:r>
+      <w:r>
+        <w:rPr>
+          <w:color w:val="000000" w:themeColor="text1"/>
+          <w:sz w:val="22"/>
+          <w:szCs w:val="22"/>
+        </w:rPr>
         <w:t xml:space="preserve"> </w:t>
       </w:r>
-      <w:r>
-        <w:rPr>
-          <w:color w:val="000000" w:themeColor="text1"/>
-          <w:sz w:val="22"/>
-          <w:szCs w:val="22"/>
-        </w:rPr>
-        <w:t>B</w:t>
-      </w:r>
-      <w:r>
-        <w:rPr>
-          <w:color w:val="000000" w:themeColor="text1"/>
-          <w:sz w:val="22"/>
-          <w:szCs w:val="22"/>
-        </w:rPr>
-        <w:t>efore</w:t>
+      <w:proofErr w:type="spellStart"/>
+      <w:r>
+        <w:rPr>
+          <w:color w:val="000000" w:themeColor="text1"/>
+          <w:sz w:val="22"/>
+          <w:szCs w:val="22"/>
+        </w:rPr>
+        <w:t>before</w:t>
+      </w:r>
+      <w:proofErr w:type="spellEnd"/>
+      <w:r>
+        <w:rPr>
+          <w:color w:val="000000" w:themeColor="text1"/>
+          <w:sz w:val="22"/>
+          <w:szCs w:val="22"/>
+        </w:rPr>
+        <w:t xml:space="preserve"> login, the time or design here depends on the before.</w:t>
+      </w:r>
+    </w:p>
+    <w:p>
+      <w:pPr>
+        <w:rPr>
+          <w:color w:val="000000" w:themeColor="text1"/>
+          <w:sz w:val="22"/>
+          <w:szCs w:val="22"/>
+        </w:rPr>
+      </w:pPr>
+      <w:r>
+        <w:rPr>
+          <w:color w:val="000000" w:themeColor="text1"/>
+          <w:sz w:val="22"/>
+          <w:szCs w:val="22"/>
+        </w:rPr>
+        <w:t>After</w:t>
       </w:r>
       <w:r>
         <w:rPr>
@@ -179,6 +222,39 @@
           <w:sz w:val="22"/>
           <w:szCs w:val="22"/>
         </w:rPr>
+        <w:t xml:space="preserve"> some reaction must occur after an action was taken by the user.</w:t>
+      </w:r>
+    </w:p>
+    <w:p>
+      <w:pPr>
+        <w:rPr>
+          <w:color w:val="000000" w:themeColor="text1"/>
+          <w:sz w:val="22"/>
+          <w:szCs w:val="22"/>
+        </w:rPr>
+      </w:pPr>
+      <w:r>
+        <w:rPr>
+          <w:color w:val="000000" w:themeColor="text1"/>
+          <w:sz w:val="22"/>
+          <w:szCs w:val="22"/>
+        </w:rPr>
+        <w:t>Between</w:t>
+      </w:r>
+      <w:r>
+        <w:rPr>
+          <w:color w:val="000000" w:themeColor="text1"/>
+          <w:sz w:val="22"/>
+          <w:szCs w:val="22"/>
+        </w:rPr>
+        <w:sym w:font="Wingdings" w:char="F0E0"/>
+      </w:r>
+      <w:r>
+        <w:rPr>
+          <w:color w:val="000000" w:themeColor="text1"/>
+          <w:sz w:val="22"/>
+          <w:szCs w:val="22"/>
+        </w:rPr>
         <w:t xml:space="preserve"> </w:t>
       </w:r>
       <w:proofErr w:type="spellStart"/>
@@ -188,7 +264,15 @@
           <w:sz w:val="22"/>
           <w:szCs w:val="22"/>
         </w:rPr>
-        <w:t>before</w:t>
+        <w:t>b</w:t>
+      </w:r>
+      <w:r>
+        <w:rPr>
+          <w:color w:val="000000" w:themeColor="text1"/>
+          <w:sz w:val="22"/>
+          <w:szCs w:val="22"/>
+        </w:rPr>
+        <w:t>etween</w:t>
       </w:r>
       <w:proofErr w:type="spellEnd"/>
       <w:r>
@@ -197,24 +281,24 @@
           <w:sz w:val="22"/>
           <w:szCs w:val="22"/>
         </w:rPr>
-        <w:t xml:space="preserve"> login, the time or design here depends on the before.</w:t>
-      </w:r>
-    </w:p>
-    <w:p>
-      <w:pPr>
-        <w:rPr>
-          <w:color w:val="000000" w:themeColor="text1"/>
-          <w:sz w:val="22"/>
-          <w:szCs w:val="22"/>
-        </w:rPr>
-      </w:pPr>
-      <w:r>
-        <w:rPr>
-          <w:color w:val="000000" w:themeColor="text1"/>
-          <w:sz w:val="22"/>
-          <w:szCs w:val="22"/>
-        </w:rPr>
-        <w:t>After</w:t>
+        <w:t xml:space="preserve"> opening and closing a file, no other process can modify it</w:t>
+      </w:r>
+    </w:p>
+    <w:p>
+      <w:pPr>
+        <w:rPr>
+          <w:color w:val="000000" w:themeColor="text1"/>
+          <w:sz w:val="22"/>
+          <w:szCs w:val="22"/>
+        </w:rPr>
+      </w:pPr>
+      <w:r>
+        <w:rPr>
+          <w:color w:val="000000" w:themeColor="text1"/>
+          <w:sz w:val="22"/>
+          <w:szCs w:val="22"/>
+        </w:rPr>
+        <w:t>after until</w:t>
       </w:r>
       <w:r>
         <w:rPr>
@@ -230,24 +314,70 @@
           <w:sz w:val="22"/>
           <w:szCs w:val="22"/>
         </w:rPr>
-        <w:t xml:space="preserve"> some reaction must occur after an action was taken by the user.</w:t>
-      </w:r>
-    </w:p>
-    <w:p>
-      <w:pPr>
-        <w:rPr>
-          <w:color w:val="000000" w:themeColor="text1"/>
-          <w:sz w:val="22"/>
-          <w:szCs w:val="22"/>
-        </w:rPr>
-      </w:pPr>
-      <w:r>
-        <w:rPr>
-          <w:color w:val="000000" w:themeColor="text1"/>
-          <w:sz w:val="22"/>
-          <w:szCs w:val="22"/>
-        </w:rPr>
-        <w:t>Between</w:t>
+        <w:t xml:space="preserve"> </w:t>
+      </w:r>
+      <w:r>
+        <w:rPr>
+          <w:color w:val="000000" w:themeColor="text1"/>
+          <w:sz w:val="22"/>
+          <w:szCs w:val="22"/>
+        </w:rPr>
+        <w:t>After pressing start, the motor must run until stop is pressed</w:t>
+      </w:r>
+      <w:r>
+        <w:rPr>
+          <w:color w:val="000000" w:themeColor="text1"/>
+          <w:sz w:val="22"/>
+          <w:szCs w:val="22"/>
+        </w:rPr>
+        <w:t>.</w:t>
+      </w:r>
+    </w:p>
+    <w:p>
+      <w:pPr>
+        <w:rPr>
+          <w:color w:val="000000" w:themeColor="text1"/>
+          <w:sz w:val="22"/>
+          <w:szCs w:val="22"/>
+        </w:rPr>
+      </w:pPr>
+    </w:p>
+    <w:p>
+      <w:pPr>
+        <w:rPr>
+          <w:b/>
+          <w:bCs/>
+          <w:color w:val="000000" w:themeColor="text1"/>
+          <w:sz w:val="22"/>
+          <w:szCs w:val="22"/>
+        </w:rPr>
+      </w:pPr>
+      <w:r>
+        <w:rPr>
+          <w:b/>
+          <w:bCs/>
+          <w:color w:val="000000" w:themeColor="text1"/>
+          <w:sz w:val="22"/>
+          <w:szCs w:val="22"/>
+        </w:rPr>
+        <w:t>Patterns aka reactions:</w:t>
+      </w:r>
+    </w:p>
+    <w:p>
+      <w:pPr>
+        <w:rPr>
+          <w:color w:val="000000" w:themeColor="text1"/>
+          <w:sz w:val="22"/>
+          <w:szCs w:val="22"/>
+        </w:rPr>
+      </w:pPr>
+      <w:r>
+        <w:rPr>
+          <w:color w:val="000000" w:themeColor="text1"/>
+          <w:sz w:val="22"/>
+          <w:szCs w:val="22"/>
+        </w:rPr>
+        <w:t>Absence</w:t>
       </w:r>
       <w:r>
         <w:rPr>
@@ -265,48 +395,38 @@
         </w:rPr>
         <w:t xml:space="preserve"> </w:t>
       </w:r>
-      <w:proofErr w:type="spellStart"/>
-      <w:r>
-        <w:rPr>
-          <w:color w:val="000000" w:themeColor="text1"/>
-          <w:sz w:val="22"/>
-          <w:szCs w:val="22"/>
-        </w:rPr>
-        <w:t>b</w:t>
-      </w:r>
-      <w:r>
-        <w:rPr>
-          <w:color w:val="000000" w:themeColor="text1"/>
-          <w:sz w:val="22"/>
-          <w:szCs w:val="22"/>
-        </w:rPr>
-        <w:t>etween</w:t>
-      </w:r>
-      <w:proofErr w:type="spellEnd"/>
-      <w:r>
-        <w:rPr>
-          <w:color w:val="000000" w:themeColor="text1"/>
-          <w:sz w:val="22"/>
-          <w:szCs w:val="22"/>
-        </w:rPr>
-        <w:t xml:space="preserve"> opening and closing a file, no other process can modify it</w:t>
-      </w:r>
-    </w:p>
-    <w:p>
-      <w:pPr>
-        <w:rPr>
-          <w:color w:val="000000" w:themeColor="text1"/>
-          <w:sz w:val="22"/>
-          <w:szCs w:val="22"/>
-        </w:rPr>
-      </w:pPr>
-      <w:r>
-        <w:rPr>
-          <w:color w:val="000000" w:themeColor="text1"/>
-          <w:sz w:val="22"/>
-          <w:szCs w:val="22"/>
-        </w:rPr>
-        <w:t>after until</w:t>
+      <w:r>
+        <w:rPr>
+          <w:color w:val="000000" w:themeColor="text1"/>
+          <w:sz w:val="22"/>
+          <w:szCs w:val="22"/>
+        </w:rPr>
+        <w:t>Error must never occur</w:t>
+      </w:r>
+      <w:r>
+        <w:rPr>
+          <w:color w:val="000000" w:themeColor="text1"/>
+          <w:sz w:val="22"/>
+          <w:szCs w:val="22"/>
+        </w:rPr>
+        <w:t>.</w:t>
+      </w:r>
+    </w:p>
+    <w:p>
+      <w:pPr>
+        <w:rPr>
+          <w:color w:val="000000" w:themeColor="text1"/>
+          <w:sz w:val="22"/>
+          <w:szCs w:val="22"/>
+        </w:rPr>
+      </w:pPr>
+      <w:r>
+        <w:rPr>
+          <w:color w:val="000000" w:themeColor="text1"/>
+          <w:sz w:val="22"/>
+          <w:szCs w:val="22"/>
+        </w:rPr>
+        <w:t>Existence</w:t>
       </w:r>
       <w:r>
         <w:rPr>
@@ -330,7 +450,7 @@
           <w:sz w:val="22"/>
           <w:szCs w:val="22"/>
         </w:rPr>
-        <w:t>After pressing start, the motor must run until stop is pressed</w:t>
+        <w:t>A request must eventually receive a response</w:t>
       </w:r>
       <w:r>
         <w:rPr>
@@ -349,43 +469,13 @@
           <w:szCs w:val="22"/>
         </w:rPr>
       </w:pPr>
-    </w:p>
-    <w:p>
-      <w:pPr>
-        <w:rPr>
-          <w:b/>
-          <w:bCs/>
-          <w:color w:val="000000" w:themeColor="text1"/>
-          <w:sz w:val="22"/>
-          <w:szCs w:val="22"/>
-        </w:rPr>
-      </w:pPr>
-      <w:r>
-        <w:rPr>
-          <w:b/>
-          <w:bCs/>
-          <w:color w:val="000000" w:themeColor="text1"/>
-          <w:sz w:val="22"/>
-          <w:szCs w:val="22"/>
-        </w:rPr>
-        <w:t>Patterns aka reactions:</w:t>
-      </w:r>
-    </w:p>
-    <w:p>
-      <w:pPr>
-        <w:rPr>
-          <w:color w:val="000000" w:themeColor="text1"/>
-          <w:sz w:val="22"/>
-          <w:szCs w:val="22"/>
-        </w:rPr>
-      </w:pPr>
-      <w:r>
-        <w:rPr>
-          <w:color w:val="000000" w:themeColor="text1"/>
-          <w:sz w:val="22"/>
-          <w:szCs w:val="22"/>
-        </w:rPr>
-        <w:t>Absence</w:t>
+      <w:r>
+        <w:rPr>
+          <w:color w:val="000000" w:themeColor="text1"/>
+          <w:sz w:val="22"/>
+          <w:szCs w:val="22"/>
+        </w:rPr>
+        <w:t>Universality</w:t>
       </w:r>
       <w:r>
         <w:rPr>
@@ -409,7 +499,114 @@
           <w:sz w:val="22"/>
           <w:szCs w:val="22"/>
         </w:rPr>
-        <w:t>Error must never occur</w:t>
+        <w:t>The temperature must always be below 100°C</w:t>
+      </w:r>
+    </w:p>
+    <w:p>
+      <w:pPr>
+        <w:rPr>
+          <w:color w:val="000000" w:themeColor="text1"/>
+          <w:sz w:val="22"/>
+          <w:szCs w:val="22"/>
+        </w:rPr>
+      </w:pPr>
+      <w:r>
+        <w:rPr>
+          <w:color w:val="000000" w:themeColor="text1"/>
+          <w:sz w:val="22"/>
+          <w:szCs w:val="22"/>
+        </w:rPr>
+        <w:t>Response</w:t>
+      </w:r>
+      <w:r>
+        <w:rPr>
+          <w:color w:val="000000" w:themeColor="text1"/>
+          <w:sz w:val="22"/>
+          <w:szCs w:val="22"/>
+        </w:rPr>
+        <w:sym w:font="Wingdings" w:char="F0E0"/>
+      </w:r>
+      <w:r>
+        <w:rPr>
+          <w:color w:val="000000" w:themeColor="text1"/>
+          <w:sz w:val="22"/>
+          <w:szCs w:val="22"/>
+        </w:rPr>
+        <w:t xml:space="preserve"> </w:t>
+      </w:r>
+      <w:r>
+        <w:rPr>
+          <w:color w:val="000000" w:themeColor="text1"/>
+          <w:sz w:val="22"/>
+          <w:szCs w:val="22"/>
+        </w:rPr>
+        <w:t>If a request is sent, a response must follow</w:t>
+      </w:r>
+    </w:p>
+    <w:p>
+      <w:pPr>
+        <w:rPr>
+          <w:color w:val="000000" w:themeColor="text1"/>
+          <w:sz w:val="22"/>
+          <w:szCs w:val="22"/>
+        </w:rPr>
+      </w:pPr>
+      <w:r>
+        <w:rPr>
+          <w:color w:val="000000" w:themeColor="text1"/>
+          <w:sz w:val="22"/>
+          <w:szCs w:val="22"/>
+        </w:rPr>
+        <w:t>Precedence</w:t>
+      </w:r>
+      <w:r>
+        <w:rPr>
+          <w:color w:val="000000" w:themeColor="text1"/>
+          <w:sz w:val="22"/>
+          <w:szCs w:val="22"/>
+        </w:rPr>
+        <w:sym w:font="Wingdings" w:char="F0E0"/>
+      </w:r>
+      <w:r>
+        <w:rPr>
+          <w:color w:val="000000" w:themeColor="text1"/>
+          <w:sz w:val="22"/>
+          <w:szCs w:val="22"/>
+        </w:rPr>
+        <w:t xml:space="preserve"> </w:t>
+      </w:r>
+      <w:r>
+        <w:rPr>
+          <w:color w:val="000000" w:themeColor="text1"/>
+          <w:sz w:val="22"/>
+          <w:szCs w:val="22"/>
+        </w:rPr>
+        <w:t>A user can only access the dashboard after login</w:t>
+      </w:r>
+    </w:p>
+    <w:p>
+      <w:pPr>
+        <w:rPr>
+          <w:color w:val="000000" w:themeColor="text1"/>
+          <w:sz w:val="22"/>
+          <w:szCs w:val="22"/>
+        </w:rPr>
+      </w:pPr>
+      <w:r>
+        <w:rPr>
+          <w:color w:val="000000" w:themeColor="text1"/>
+          <w:sz w:val="22"/>
+          <w:szCs w:val="22"/>
+        </w:rPr>
+        <w:t>Chain Pattern</w:t>
+      </w:r>
+      <w:r>
+        <w:rPr>
+          <w:color w:val="000000" w:themeColor="text1"/>
+          <w:sz w:val="22"/>
+          <w:szCs w:val="22"/>
+        </w:rPr>
+        <w:t xml:space="preserve"> → A → B → C must follow in order</w:t>
       </w:r>
       <w:r>
         <w:rPr>
@@ -428,21 +625,194 @@
           <w:szCs w:val="22"/>
         </w:rPr>
       </w:pPr>
-      <w:r>
-        <w:rPr>
-          <w:color w:val="000000" w:themeColor="text1"/>
-          <w:sz w:val="22"/>
-          <w:szCs w:val="22"/>
-        </w:rPr>
-        <w:t>Existence</w:t>
-      </w:r>
-      <w:r>
-        <w:rPr>
-          <w:color w:val="000000" w:themeColor="text1"/>
-          <w:sz w:val="22"/>
-          <w:szCs w:val="22"/>
-        </w:rPr>
-        <w:sym w:font="Wingdings" w:char="F0E0"/>
+    </w:p>
+    <w:p>
+      <w:pPr>
+        <w:rPr>
+          <w:b/>
+          <w:bCs/>
+          <w:color w:val="000000" w:themeColor="text1"/>
+          <w:u w:val="single"/>
+        </w:rPr>
+      </w:pPr>
+      <w:r>
+        <w:rPr>
+          <w:b/>
+          <w:bCs/>
+          <w:color w:val="000000" w:themeColor="text1"/>
+          <w:u w:val="single"/>
+        </w:rPr>
+        <w:t>What is Software Architecture:</w:t>
+      </w:r>
+    </w:p>
+    <w:p>
+      <w:pPr>
+        <w:rPr>
+          <w:color w:val="000000" w:themeColor="text1"/>
+          <w:sz w:val="22"/>
+          <w:szCs w:val="22"/>
+        </w:rPr>
+      </w:pPr>
+      <w:r>
+        <w:rPr>
+          <w:color w:val="000000" w:themeColor="text1"/>
+          <w:sz w:val="22"/>
+          <w:szCs w:val="22"/>
+        </w:rPr>
+        <w:t>The fundamental organization of a system embodied in its components, their relationships to each other, and to the environment, and the principles guiding its design and evolution.</w:t>
+      </w:r>
+    </w:p>
+    <w:p>
+      <w:pPr>
+        <w:rPr>
+          <w:color w:val="000000" w:themeColor="text1"/>
+          <w:sz w:val="22"/>
+          <w:szCs w:val="22"/>
+        </w:rPr>
+      </w:pPr>
+    </w:p>
+    <w:p>
+      <w:pPr>
+        <w:rPr>
+          <w:b/>
+          <w:bCs/>
+          <w:color w:val="000000" w:themeColor="text1"/>
+          <w:u w:val="single"/>
+        </w:rPr>
+      </w:pPr>
+      <w:r>
+        <w:rPr>
+          <w:b/>
+          <w:bCs/>
+          <w:color w:val="000000" w:themeColor="text1"/>
+          <w:u w:val="single"/>
+        </w:rPr>
+        <w:t>What is a Software Architect:</w:t>
+      </w:r>
+    </w:p>
+    <w:p>
+      <w:pPr>
+        <w:rPr>
+          <w:color w:val="000000" w:themeColor="text1"/>
+          <w:sz w:val="22"/>
+          <w:szCs w:val="22"/>
+        </w:rPr>
+      </w:pPr>
+      <w:r>
+        <w:rPr>
+          <w:color w:val="000000" w:themeColor="text1"/>
+          <w:sz w:val="22"/>
+          <w:szCs w:val="22"/>
+        </w:rPr>
+        <w:t xml:space="preserve">„a software </w:t>
+      </w:r>
+      <w:proofErr w:type="gramStart"/>
+      <w:r>
+        <w:rPr>
+          <w:color w:val="000000" w:themeColor="text1"/>
+          <w:sz w:val="22"/>
+          <w:szCs w:val="22"/>
+        </w:rPr>
+        <w:t>engineer</w:t>
+      </w:r>
+      <w:proofErr w:type="gramEnd"/>
+      <w:r>
+        <w:rPr>
+          <w:color w:val="000000" w:themeColor="text1"/>
+          <w:sz w:val="22"/>
+          <w:szCs w:val="22"/>
+        </w:rPr>
+        <w:t xml:space="preserve"> responsible for high-level design choices related to overall system structure and behavior</w:t>
+      </w:r>
+      <w:r>
+        <w:rPr>
+          <w:color w:val="000000" w:themeColor="text1"/>
+          <w:sz w:val="22"/>
+          <w:szCs w:val="22"/>
+        </w:rPr>
+        <w:t xml:space="preserve">”, they have these roles: </w:t>
+      </w:r>
+      <w:r>
+        <w:rPr>
+          <w:color w:val="000000" w:themeColor="text1"/>
+          <w:sz w:val="22"/>
+          <w:szCs w:val="22"/>
+        </w:rPr>
+        <w:t>Technical Expert</w:t>
+      </w:r>
+      <w:r>
+        <w:rPr>
+          <w:color w:val="000000" w:themeColor="text1"/>
+          <w:sz w:val="22"/>
+          <w:szCs w:val="22"/>
+        </w:rPr>
+        <w:t xml:space="preserve">, </w:t>
+      </w:r>
+      <w:proofErr w:type="gramStart"/>
+      <w:r>
+        <w:rPr>
+          <w:color w:val="000000" w:themeColor="text1"/>
+          <w:sz w:val="22"/>
+          <w:szCs w:val="22"/>
+        </w:rPr>
+        <w:t>Leader</w:t>
+      </w:r>
+      <w:r>
+        <w:rPr>
+          <w:color w:val="000000" w:themeColor="text1"/>
+          <w:sz w:val="22"/>
+          <w:szCs w:val="22"/>
+        </w:rPr>
+        <w:t xml:space="preserve">, </w:t>
+      </w:r>
+      <w:r>
+        <w:rPr>
+          <w:color w:val="000000" w:themeColor="text1"/>
+          <w:sz w:val="22"/>
+          <w:szCs w:val="22"/>
+        </w:rPr>
+        <w:t xml:space="preserve"> Teacher</w:t>
+      </w:r>
+      <w:proofErr w:type="gramEnd"/>
+      <w:r>
+        <w:rPr>
+          <w:color w:val="000000" w:themeColor="text1"/>
+          <w:sz w:val="22"/>
+          <w:szCs w:val="22"/>
+        </w:rPr>
+        <w:t xml:space="preserve">, </w:t>
+      </w:r>
+      <w:r>
+        <w:rPr>
+          <w:color w:val="000000" w:themeColor="text1"/>
+          <w:sz w:val="22"/>
+          <w:szCs w:val="22"/>
+        </w:rPr>
+        <w:t>Negotiator</w:t>
+      </w:r>
+      <w:r>
+        <w:rPr>
+          <w:color w:val="000000" w:themeColor="text1"/>
+          <w:sz w:val="22"/>
+          <w:szCs w:val="22"/>
+        </w:rPr>
+        <w:t>,</w:t>
+      </w:r>
+      <w:r>
+        <w:rPr>
+          <w:color w:val="000000" w:themeColor="text1"/>
+          <w:sz w:val="22"/>
+          <w:szCs w:val="22"/>
+        </w:rPr>
+        <w:t xml:space="preserve"> Consultant</w:t>
+      </w:r>
+      <w:r>
+        <w:rPr>
+          <w:color w:val="000000" w:themeColor="text1"/>
+          <w:sz w:val="22"/>
+          <w:szCs w:val="22"/>
+        </w:rPr>
+        <w:t>.</w:t>
       </w:r>
       <w:r>
         <w:rPr>
@@ -451,376 +821,6 @@
           <w:szCs w:val="22"/>
         </w:rPr>
         <w:t xml:space="preserve"> </w:t>
-      </w:r>
-      <w:r>
-        <w:rPr>
-          <w:color w:val="000000" w:themeColor="text1"/>
-          <w:sz w:val="22"/>
-          <w:szCs w:val="22"/>
-        </w:rPr>
-        <w:t>A request must eventually receive a response</w:t>
-      </w:r>
-      <w:r>
-        <w:rPr>
-          <w:color w:val="000000" w:themeColor="text1"/>
-          <w:sz w:val="22"/>
-          <w:szCs w:val="22"/>
-        </w:rPr>
-        <w:t>.</w:t>
-      </w:r>
-    </w:p>
-    <w:p>
-      <w:pPr>
-        <w:rPr>
-          <w:color w:val="000000" w:themeColor="text1"/>
-          <w:sz w:val="22"/>
-          <w:szCs w:val="22"/>
-        </w:rPr>
-      </w:pPr>
-      <w:r>
-        <w:rPr>
-          <w:color w:val="000000" w:themeColor="text1"/>
-          <w:sz w:val="22"/>
-          <w:szCs w:val="22"/>
-        </w:rPr>
-        <w:t>Universality</w:t>
-      </w:r>
-      <w:r>
-        <w:rPr>
-          <w:color w:val="000000" w:themeColor="text1"/>
-          <w:sz w:val="22"/>
-          <w:szCs w:val="22"/>
-        </w:rPr>
-        <w:sym w:font="Wingdings" w:char="F0E0"/>
-      </w:r>
-      <w:r>
-        <w:rPr>
-          <w:color w:val="000000" w:themeColor="text1"/>
-          <w:sz w:val="22"/>
-          <w:szCs w:val="22"/>
-        </w:rPr>
-        <w:t xml:space="preserve"> </w:t>
-      </w:r>
-      <w:r>
-        <w:rPr>
-          <w:color w:val="000000" w:themeColor="text1"/>
-          <w:sz w:val="22"/>
-          <w:szCs w:val="22"/>
-        </w:rPr>
-        <w:t>The temperature must always be below 100°C</w:t>
-      </w:r>
-    </w:p>
-    <w:p>
-      <w:pPr>
-        <w:rPr>
-          <w:color w:val="000000" w:themeColor="text1"/>
-          <w:sz w:val="22"/>
-          <w:szCs w:val="22"/>
-        </w:rPr>
-      </w:pPr>
-      <w:r>
-        <w:rPr>
-          <w:color w:val="000000" w:themeColor="text1"/>
-          <w:sz w:val="22"/>
-          <w:szCs w:val="22"/>
-        </w:rPr>
-        <w:t>Response</w:t>
-      </w:r>
-      <w:r>
-        <w:rPr>
-          <w:color w:val="000000" w:themeColor="text1"/>
-          <w:sz w:val="22"/>
-          <w:szCs w:val="22"/>
-        </w:rPr>
-        <w:sym w:font="Wingdings" w:char="F0E0"/>
-      </w:r>
-      <w:r>
-        <w:rPr>
-          <w:color w:val="000000" w:themeColor="text1"/>
-          <w:sz w:val="22"/>
-          <w:szCs w:val="22"/>
-        </w:rPr>
-        <w:t xml:space="preserve"> </w:t>
-      </w:r>
-      <w:r>
-        <w:rPr>
-          <w:color w:val="000000" w:themeColor="text1"/>
-          <w:sz w:val="22"/>
-          <w:szCs w:val="22"/>
-        </w:rPr>
-        <w:t>If a request is sent, a response must follow</w:t>
-      </w:r>
-    </w:p>
-    <w:p>
-      <w:pPr>
-        <w:rPr>
-          <w:color w:val="000000" w:themeColor="text1"/>
-          <w:sz w:val="22"/>
-          <w:szCs w:val="22"/>
-        </w:rPr>
-      </w:pPr>
-      <w:r>
-        <w:rPr>
-          <w:color w:val="000000" w:themeColor="text1"/>
-          <w:sz w:val="22"/>
-          <w:szCs w:val="22"/>
-        </w:rPr>
-        <w:t>Precedence</w:t>
-      </w:r>
-      <w:r>
-        <w:rPr>
-          <w:color w:val="000000" w:themeColor="text1"/>
-          <w:sz w:val="22"/>
-          <w:szCs w:val="22"/>
-        </w:rPr>
-        <w:sym w:font="Wingdings" w:char="F0E0"/>
-      </w:r>
-      <w:r>
-        <w:rPr>
-          <w:color w:val="000000" w:themeColor="text1"/>
-          <w:sz w:val="22"/>
-          <w:szCs w:val="22"/>
-        </w:rPr>
-        <w:t xml:space="preserve"> </w:t>
-      </w:r>
-      <w:r>
-        <w:rPr>
-          <w:color w:val="000000" w:themeColor="text1"/>
-          <w:sz w:val="22"/>
-          <w:szCs w:val="22"/>
-        </w:rPr>
-        <w:t>A user can only access the dashboard after login</w:t>
-      </w:r>
-    </w:p>
-    <w:p>
-      <w:pPr>
-        <w:rPr>
-          <w:color w:val="000000" w:themeColor="text1"/>
-          <w:sz w:val="22"/>
-          <w:szCs w:val="22"/>
-        </w:rPr>
-      </w:pPr>
-      <w:r>
-        <w:rPr>
-          <w:color w:val="000000" w:themeColor="text1"/>
-          <w:sz w:val="22"/>
-          <w:szCs w:val="22"/>
-        </w:rPr>
-        <w:t>Chain Pattern</w:t>
-      </w:r>
-      <w:r>
-        <w:rPr>
-          <w:color w:val="000000" w:themeColor="text1"/>
-          <w:sz w:val="22"/>
-          <w:szCs w:val="22"/>
-        </w:rPr>
-        <w:t xml:space="preserve"> → A → B → C must follow in order</w:t>
-      </w:r>
-      <w:r>
-        <w:rPr>
-          <w:color w:val="000000" w:themeColor="text1"/>
-          <w:sz w:val="22"/>
-          <w:szCs w:val="22"/>
-        </w:rPr>
-        <w:t>.</w:t>
-      </w:r>
-    </w:p>
-    <w:p>
-      <w:pPr>
-        <w:rPr>
-          <w:color w:val="000000" w:themeColor="text1"/>
-          <w:sz w:val="22"/>
-          <w:szCs w:val="22"/>
-        </w:rPr>
-      </w:pPr>
-    </w:p>
-    <w:p>
-      <w:pPr>
-        <w:rPr>
-          <w:b/>
-          <w:bCs/>
-          <w:color w:val="000000" w:themeColor="text1"/>
-          <w:u w:val="single"/>
-        </w:rPr>
-      </w:pPr>
-      <w:r>
-        <w:rPr>
-          <w:b/>
-          <w:bCs/>
-          <w:color w:val="000000" w:themeColor="text1"/>
-          <w:u w:val="single"/>
-        </w:rPr>
-        <w:t>What is Software Architecture:</w:t>
-      </w:r>
-    </w:p>
-    <w:p>
-      <w:pPr>
-        <w:rPr>
-          <w:color w:val="000000" w:themeColor="text1"/>
-          <w:sz w:val="22"/>
-          <w:szCs w:val="22"/>
-        </w:rPr>
-      </w:pPr>
-      <w:r>
-        <w:rPr>
-          <w:color w:val="000000" w:themeColor="text1"/>
-          <w:sz w:val="22"/>
-          <w:szCs w:val="22"/>
-        </w:rPr>
-        <w:t>The fundamental organization of a system embodied in its components, their relationships to each other, and to the environment, and the principles guiding its design and evolution.</w:t>
-      </w:r>
-    </w:p>
-    <w:p>
-      <w:pPr>
-        <w:rPr>
-          <w:color w:val="000000" w:themeColor="text1"/>
-          <w:sz w:val="22"/>
-          <w:szCs w:val="22"/>
-        </w:rPr>
-      </w:pPr>
-    </w:p>
-    <w:p>
-      <w:pPr>
-        <w:rPr>
-          <w:b/>
-          <w:bCs/>
-          <w:color w:val="000000" w:themeColor="text1"/>
-          <w:u w:val="single"/>
-        </w:rPr>
-      </w:pPr>
-      <w:r>
-        <w:rPr>
-          <w:b/>
-          <w:bCs/>
-          <w:color w:val="000000" w:themeColor="text1"/>
-          <w:u w:val="single"/>
-        </w:rPr>
-        <w:t>What is a Software Architect:</w:t>
-      </w:r>
-    </w:p>
-    <w:p>
-      <w:pPr>
-        <w:rPr>
-          <w:color w:val="000000" w:themeColor="text1"/>
-          <w:sz w:val="22"/>
-          <w:szCs w:val="22"/>
-        </w:rPr>
-      </w:pPr>
-      <w:r>
-        <w:rPr>
-          <w:color w:val="000000" w:themeColor="text1"/>
-          <w:sz w:val="22"/>
-          <w:szCs w:val="22"/>
-        </w:rPr>
-        <w:t xml:space="preserve">„a software </w:t>
-      </w:r>
-      <w:proofErr w:type="gramStart"/>
-      <w:r>
-        <w:rPr>
-          <w:color w:val="000000" w:themeColor="text1"/>
-          <w:sz w:val="22"/>
-          <w:szCs w:val="22"/>
-        </w:rPr>
-        <w:t>engineer</w:t>
-      </w:r>
-      <w:proofErr w:type="gramEnd"/>
-      <w:r>
-        <w:rPr>
-          <w:color w:val="000000" w:themeColor="text1"/>
-          <w:sz w:val="22"/>
-          <w:szCs w:val="22"/>
-        </w:rPr>
-        <w:t xml:space="preserve"> responsible for high-level design choices related to overall system structure and behavior</w:t>
-      </w:r>
-      <w:r>
-        <w:rPr>
-          <w:color w:val="000000" w:themeColor="text1"/>
-          <w:sz w:val="22"/>
-          <w:szCs w:val="22"/>
-        </w:rPr>
-        <w:t xml:space="preserve">”, they have these roles: </w:t>
-      </w:r>
-      <w:r>
-        <w:rPr>
-          <w:color w:val="000000" w:themeColor="text1"/>
-          <w:sz w:val="22"/>
-          <w:szCs w:val="22"/>
-        </w:rPr>
-        <w:t>Technical Expert</w:t>
-      </w:r>
-      <w:r>
-        <w:rPr>
-          <w:color w:val="000000" w:themeColor="text1"/>
-          <w:sz w:val="22"/>
-          <w:szCs w:val="22"/>
-        </w:rPr>
-        <w:t xml:space="preserve">, </w:t>
-      </w:r>
-      <w:proofErr w:type="gramStart"/>
-      <w:r>
-        <w:rPr>
-          <w:color w:val="000000" w:themeColor="text1"/>
-          <w:sz w:val="22"/>
-          <w:szCs w:val="22"/>
-        </w:rPr>
-        <w:t>Leader</w:t>
-      </w:r>
-      <w:r>
-        <w:rPr>
-          <w:color w:val="000000" w:themeColor="text1"/>
-          <w:sz w:val="22"/>
-          <w:szCs w:val="22"/>
-        </w:rPr>
-        <w:t xml:space="preserve">, </w:t>
-      </w:r>
-      <w:r>
-        <w:rPr>
-          <w:color w:val="000000" w:themeColor="text1"/>
-          <w:sz w:val="22"/>
-          <w:szCs w:val="22"/>
-        </w:rPr>
-        <w:t xml:space="preserve"> Teacher</w:t>
-      </w:r>
-      <w:proofErr w:type="gramEnd"/>
-      <w:r>
-        <w:rPr>
-          <w:color w:val="000000" w:themeColor="text1"/>
-          <w:sz w:val="22"/>
-          <w:szCs w:val="22"/>
-        </w:rPr>
-        <w:t xml:space="preserve">, </w:t>
-      </w:r>
-      <w:r>
-        <w:rPr>
-          <w:color w:val="000000" w:themeColor="text1"/>
-          <w:sz w:val="22"/>
-          <w:szCs w:val="22"/>
-        </w:rPr>
-        <w:t>Negotiator</w:t>
-      </w:r>
-      <w:r>
-        <w:rPr>
-          <w:color w:val="000000" w:themeColor="text1"/>
-          <w:sz w:val="22"/>
-          <w:szCs w:val="22"/>
-        </w:rPr>
-        <w:t>,</w:t>
-      </w:r>
-      <w:r>
-        <w:rPr>
-          <w:color w:val="000000" w:themeColor="text1"/>
-          <w:sz w:val="22"/>
-          <w:szCs w:val="22"/>
-        </w:rPr>
-        <w:t xml:space="preserve"> Consultant</w:t>
-      </w:r>
-      <w:r>
-        <w:rPr>
-          <w:color w:val="000000" w:themeColor="text1"/>
-          <w:sz w:val="22"/>
-          <w:szCs w:val="22"/>
-        </w:rPr>
-        <w:t>.</w:t>
       </w:r>
     </w:p>
     <w:p>
@@ -885,13 +885,23 @@
           <w:szCs w:val="22"/>
         </w:rPr>
       </w:pPr>
-      <w:r>
-        <w:rPr>
-          <w:color w:val="000000" w:themeColor="text1"/>
-          <w:sz w:val="22"/>
-          <w:szCs w:val="22"/>
-        </w:rPr>
-        <w:t xml:space="preserve">Conway’s law main idea is that the software architecture will sooner or later reflect how the communication in the company </w:t>
+      <w:proofErr w:type="gramStart"/>
+      <w:r>
+        <w:rPr>
+          <w:color w:val="000000" w:themeColor="text1"/>
+          <w:sz w:val="22"/>
+          <w:szCs w:val="22"/>
+        </w:rPr>
+        <w:t>Conway’s law</w:t>
+      </w:r>
+      <w:proofErr w:type="gramEnd"/>
+      <w:r>
+        <w:rPr>
+          <w:color w:val="000000" w:themeColor="text1"/>
+          <w:sz w:val="22"/>
+          <w:szCs w:val="22"/>
+        </w:rPr>
+        <w:t xml:space="preserve"> main idea is that the software architecture will sooner or later reflect how the communication in the company </w:t>
       </w:r>
       <w:proofErr w:type="gramStart"/>
       <w:r>
@@ -1284,7 +1294,7 @@
           <w:color w:val="000000" w:themeColor="text1"/>
           <w:u w:val="single"/>
         </w:rPr>
-        <w:t xml:space="preserve">Why do we collect quality requirements for a software </w:t>
+        <w:t xml:space="preserve">Why do we collect quality requirements for </w:t>
       </w:r>
       <w:proofErr w:type="gramStart"/>
       <w:r>
@@ -1294,8 +1304,9 @@
           <w:color w:val="000000" w:themeColor="text1"/>
           <w:u w:val="single"/>
         </w:rPr>
-        <w:t>architecture?</w:t>
-      </w:r>
+        <w:t>a software</w:t>
+      </w:r>
+      <w:proofErr w:type="gramEnd"/>
       <w:r>
         <w:rPr>
           <w:b/>
@@ -1303,7 +1314,17 @@
           <w:color w:val="000000" w:themeColor="text1"/>
           <w:u w:val="single"/>
         </w:rPr>
-        <w:t>:</w:t>
+        <w:t xml:space="preserve"> </w:t>
+      </w:r>
+      <w:proofErr w:type="gramStart"/>
+      <w:r>
+        <w:rPr>
+          <w:b/>
+          <w:bCs/>
+          <w:color w:val="000000" w:themeColor="text1"/>
+          <w:u w:val="single"/>
+        </w:rPr>
+        <w:t>architecture?:</w:t>
       </w:r>
       <w:proofErr w:type="gramEnd"/>
       <w:r>
@@ -1530,16 +1551,14 @@
         </w:rPr>
         <w:t xml:space="preserve"> Where a cog represents a module, or a database/dataset. And the arrow </w:t>
       </w:r>
-      <w:proofErr w:type="spellStart"/>
-      <w:r>
-        <w:rPr>
-          <w:color w:val="000000" w:themeColor="text1"/>
-          <w:sz w:val="22"/>
-          <w:szCs w:val="22"/>
-        </w:rPr>
-        <w:t>reperesents</w:t>
-      </w:r>
-      <w:proofErr w:type="spellEnd"/>
+      <w:r>
+        <w:rPr>
+          <w:color w:val="000000" w:themeColor="text1"/>
+          <w:sz w:val="22"/>
+          <w:szCs w:val="22"/>
+        </w:rPr>
+        <w:t>represents</w:t>
+      </w:r>
       <w:r>
         <w:rPr>
           <w:color w:val="000000" w:themeColor="text1"/>
@@ -1838,6 +1857,90 @@
         </w:rPr>
         <w:t xml:space="preserve"> big picture and the </w:t>
       </w:r>
+      <w:r>
+        <w:rPr>
+          <w:color w:val="000000" w:themeColor="text1"/>
+          <w:sz w:val="22"/>
+          <w:szCs w:val="22"/>
+        </w:rPr>
+        <w:t>organizational</w:t>
+      </w:r>
+      <w:r>
+        <w:rPr>
+          <w:color w:val="000000" w:themeColor="text1"/>
+          <w:sz w:val="22"/>
+          <w:szCs w:val="22"/>
+        </w:rPr>
+        <w:t xml:space="preserve"> design</w:t>
+      </w:r>
+    </w:p>
+    <w:p>
+      <w:pPr>
+        <w:rPr>
+          <w:color w:val="000000" w:themeColor="text1"/>
+          <w:sz w:val="22"/>
+          <w:szCs w:val="22"/>
+        </w:rPr>
+      </w:pPr>
+      <w:r>
+        <w:rPr>
+          <w:color w:val="000000" w:themeColor="text1"/>
+          <w:sz w:val="22"/>
+          <w:szCs w:val="22"/>
+        </w:rPr>
+        <w:t xml:space="preserve">Architecture dealing with large </w:t>
+      </w:r>
+      <w:r>
+        <w:rPr>
+          <w:color w:val="000000" w:themeColor="text1"/>
+          <w:sz w:val="22"/>
+          <w:szCs w:val="22"/>
+        </w:rPr>
+        <w:t>high-level</w:t>
+      </w:r>
+      <w:r>
+        <w:rPr>
+          <w:color w:val="000000" w:themeColor="text1"/>
+          <w:sz w:val="22"/>
+          <w:szCs w:val="22"/>
+        </w:rPr>
+        <w:t xml:space="preserve"> decisions.</w:t>
+      </w:r>
+    </w:p>
+    <w:p>
+      <w:pPr>
+        <w:rPr>
+          <w:color w:val="000000" w:themeColor="text1"/>
+          <w:sz w:val="22"/>
+          <w:szCs w:val="22"/>
+        </w:rPr>
+      </w:pPr>
+      <w:r>
+        <w:rPr>
+          <w:color w:val="000000" w:themeColor="text1"/>
+          <w:sz w:val="22"/>
+          <w:szCs w:val="22"/>
+        </w:rPr>
+        <w:t xml:space="preserve">It deals with decisions that </w:t>
+      </w:r>
+      <w:proofErr w:type="gramStart"/>
+      <w:r>
+        <w:rPr>
+          <w:color w:val="000000" w:themeColor="text1"/>
+          <w:sz w:val="22"/>
+          <w:szCs w:val="22"/>
+        </w:rPr>
+        <w:t>affects</w:t>
+      </w:r>
+      <w:proofErr w:type="gramEnd"/>
+      <w:r>
+        <w:rPr>
+          <w:color w:val="000000" w:themeColor="text1"/>
+          <w:sz w:val="22"/>
+          <w:szCs w:val="22"/>
+        </w:rPr>
+        <w:t xml:space="preserve"> multiple teams, multiple </w:t>
+      </w:r>
       <w:proofErr w:type="spellStart"/>
       <w:r>
         <w:rPr>
@@ -1845,7 +1948,7 @@
           <w:sz w:val="22"/>
           <w:szCs w:val="22"/>
         </w:rPr>
-        <w:t>organiziational</w:t>
+        <w:t>softwares</w:t>
       </w:r>
       <w:proofErr w:type="spellEnd"/>
       <w:r>
@@ -1854,76 +1957,6 @@
           <w:sz w:val="22"/>
           <w:szCs w:val="22"/>
         </w:rPr>
-        <w:t xml:space="preserve"> design</w:t>
-      </w:r>
-    </w:p>
-    <w:p>
-      <w:pPr>
-        <w:rPr>
-          <w:color w:val="000000" w:themeColor="text1"/>
-          <w:sz w:val="22"/>
-          <w:szCs w:val="22"/>
-        </w:rPr>
-      </w:pPr>
-      <w:r>
-        <w:rPr>
-          <w:color w:val="000000" w:themeColor="text1"/>
-          <w:sz w:val="22"/>
-          <w:szCs w:val="22"/>
-        </w:rPr>
-        <w:t xml:space="preserve">Architecture dealing with large </w:t>
-      </w:r>
-      <w:proofErr w:type="gramStart"/>
-      <w:r>
-        <w:rPr>
-          <w:color w:val="000000" w:themeColor="text1"/>
-          <w:sz w:val="22"/>
-          <w:szCs w:val="22"/>
-        </w:rPr>
-        <w:t>high level</w:t>
-      </w:r>
-      <w:proofErr w:type="gramEnd"/>
-      <w:r>
-        <w:rPr>
-          <w:color w:val="000000" w:themeColor="text1"/>
-          <w:sz w:val="22"/>
-          <w:szCs w:val="22"/>
-        </w:rPr>
-        <w:t xml:space="preserve"> decisions.</w:t>
-      </w:r>
-    </w:p>
-    <w:p>
-      <w:pPr>
-        <w:rPr>
-          <w:color w:val="000000" w:themeColor="text1"/>
-          <w:sz w:val="22"/>
-          <w:szCs w:val="22"/>
-        </w:rPr>
-      </w:pPr>
-      <w:r>
-        <w:rPr>
-          <w:color w:val="000000" w:themeColor="text1"/>
-          <w:sz w:val="22"/>
-          <w:szCs w:val="22"/>
-        </w:rPr>
-        <w:t xml:space="preserve">It deals with decisions that affects multiple teams, multiple </w:t>
-      </w:r>
-      <w:proofErr w:type="spellStart"/>
-      <w:r>
-        <w:rPr>
-          <w:color w:val="000000" w:themeColor="text1"/>
-          <w:sz w:val="22"/>
-          <w:szCs w:val="22"/>
-        </w:rPr>
-        <w:t>softwares</w:t>
-      </w:r>
-      <w:proofErr w:type="spellEnd"/>
-      <w:r>
-        <w:rPr>
-          <w:color w:val="000000" w:themeColor="text1"/>
-          <w:sz w:val="22"/>
-          <w:szCs w:val="22"/>
-        </w:rPr>
         <w:t>.</w:t>
       </w:r>
     </w:p>
@@ -1994,6 +2027,57 @@
           <w:szCs w:val="22"/>
         </w:rPr>
       </w:pPr>
+      <w:r>
+        <w:rPr>
+          <w:color w:val="000000" w:themeColor="text1"/>
+          <w:sz w:val="22"/>
+          <w:szCs w:val="22"/>
+        </w:rPr>
+        <w:t xml:space="preserve">Monolithic architecture – The application is built as a single deployable unit. </w:t>
+      </w:r>
+    </w:p>
+    <w:p>
+      <w:pPr>
+        <w:rPr>
+          <w:color w:val="000000" w:themeColor="text1"/>
+          <w:sz w:val="22"/>
+          <w:szCs w:val="22"/>
+        </w:rPr>
+      </w:pPr>
+      <w:r>
+        <w:rPr>
+          <w:color w:val="000000" w:themeColor="text1"/>
+          <w:sz w:val="22"/>
+          <w:szCs w:val="22"/>
+        </w:rPr>
+        <w:t xml:space="preserve">Microservices architecture – The system is divided into independent services that communicate over APIs. </w:t>
+      </w:r>
+    </w:p>
+    <w:p>
+      <w:pPr>
+        <w:rPr>
+          <w:color w:val="000000" w:themeColor="text1"/>
+          <w:sz w:val="22"/>
+          <w:szCs w:val="22"/>
+        </w:rPr>
+      </w:pPr>
+      <w:r>
+        <w:rPr>
+          <w:color w:val="000000" w:themeColor="text1"/>
+          <w:sz w:val="22"/>
+          <w:szCs w:val="22"/>
+        </w:rPr>
+        <w:t>Event-driven architecture – Components communicate by publishing and consuming events.</w:t>
+      </w:r>
+    </w:p>
+    <w:p>
+      <w:pPr>
+        <w:rPr>
+          <w:color w:val="000000" w:themeColor="text1"/>
+          <w:sz w:val="22"/>
+          <w:szCs w:val="22"/>
+        </w:rPr>
+      </w:pPr>
     </w:p>
     <w:p>
       <w:pPr>
@@ -2125,33 +2209,123 @@
           <w:szCs w:val="22"/>
         </w:rPr>
       </w:pPr>
-    </w:p>
-    <w:p>
-      <w:pPr>
-        <w:rPr>
-          <w:color w:val="000000" w:themeColor="text1"/>
-          <w:sz w:val="22"/>
-          <w:szCs w:val="22"/>
-        </w:rPr>
-      </w:pPr>
-    </w:p>
-    <w:p>
-      <w:pPr>
-        <w:rPr>
-          <w:color w:val="000000" w:themeColor="text1"/>
-          <w:sz w:val="22"/>
-          <w:szCs w:val="22"/>
-        </w:rPr>
-      </w:pPr>
-    </w:p>
-    <w:p>
-      <w:pPr>
-        <w:rPr>
-          <w:color w:val="000000" w:themeColor="text1"/>
-          <w:sz w:val="22"/>
-          <w:szCs w:val="22"/>
-        </w:rPr>
-      </w:pPr>
+      <w:r>
+        <w:rPr>
+          <w:color w:val="000000" w:themeColor="text1"/>
+          <w:sz w:val="22"/>
+          <w:szCs w:val="22"/>
+        </w:rPr>
+        <w:t xml:space="preserve">Using the </w:t>
+      </w:r>
+      <w:r>
+        <w:rPr>
+          <w:b/>
+          <w:bCs/>
+          <w:color w:val="000000" w:themeColor="text1"/>
+          <w:sz w:val="22"/>
+          <w:szCs w:val="22"/>
+        </w:rPr>
+        <w:t>Factory</w:t>
+      </w:r>
+      <w:r>
+        <w:rPr>
+          <w:color w:val="000000" w:themeColor="text1"/>
+          <w:sz w:val="22"/>
+          <w:szCs w:val="22"/>
+        </w:rPr>
+        <w:t xml:space="preserve"> pattern for object creation.</w:t>
+      </w:r>
+    </w:p>
+    <w:p>
+      <w:pPr>
+        <w:rPr>
+          <w:color w:val="000000" w:themeColor="text1"/>
+          <w:sz w:val="22"/>
+          <w:szCs w:val="22"/>
+        </w:rPr>
+      </w:pPr>
+    </w:p>
+    <w:p>
+      <w:pPr>
+        <w:rPr>
+          <w:color w:val="000000" w:themeColor="text1"/>
+          <w:sz w:val="22"/>
+          <w:szCs w:val="22"/>
+        </w:rPr>
+      </w:pPr>
+      <w:r>
+        <w:rPr>
+          <w:b/>
+          <w:bCs/>
+          <w:color w:val="000000" w:themeColor="text1"/>
+          <w:sz w:val="22"/>
+          <w:szCs w:val="22"/>
+        </w:rPr>
+        <w:t>M</w:t>
+      </w:r>
+      <w:r>
+        <w:rPr>
+          <w:b/>
+          <w:bCs/>
+          <w:color w:val="000000" w:themeColor="text1"/>
+          <w:sz w:val="22"/>
+          <w:szCs w:val="22"/>
+        </w:rPr>
+        <w:t>acro architecture</w:t>
+      </w:r>
+      <w:r>
+        <w:rPr>
+          <w:color w:val="000000" w:themeColor="text1"/>
+          <w:sz w:val="22"/>
+          <w:szCs w:val="22"/>
+        </w:rPr>
+        <w:t xml:space="preserve"> refers to the high-level system design—how different applications or major services talk to each other. </w:t>
+      </w:r>
+    </w:p>
+    <w:p>
+      <w:pPr>
+        <w:rPr>
+          <w:color w:val="000000" w:themeColor="text1"/>
+          <w:sz w:val="22"/>
+          <w:szCs w:val="22"/>
+        </w:rPr>
+      </w:pPr>
+      <w:r>
+        <w:rPr>
+          <w:b/>
+          <w:bCs/>
+          <w:color w:val="000000" w:themeColor="text1"/>
+          <w:sz w:val="22"/>
+          <w:szCs w:val="22"/>
+        </w:rPr>
+        <w:t>Micro architecture</w:t>
+      </w:r>
+      <w:r>
+        <w:rPr>
+          <w:color w:val="000000" w:themeColor="text1"/>
+          <w:sz w:val="22"/>
+          <w:szCs w:val="22"/>
+        </w:rPr>
+        <w:t xml:space="preserve"> focuses on the low-level design—the internal code structure, logic, and component behaviors </w:t>
+      </w:r>
+      <w:r>
+        <w:rPr>
+          <w:i/>
+          <w:iCs/>
+          <w:color w:val="000000" w:themeColor="text1"/>
+          <w:sz w:val="22"/>
+          <w:szCs w:val="22"/>
+        </w:rPr>
+        <w:t>within</w:t>
+      </w:r>
+      <w:r>
+        <w:rPr>
+          <w:color w:val="000000" w:themeColor="text1"/>
+          <w:sz w:val="22"/>
+          <w:szCs w:val="22"/>
+        </w:rPr>
+        <w:t xml:space="preserve"> a single service</w:t>
+      </w:r>
     </w:p>
     <w:sectPr>
       <w:pgSz w:w="12240" w:h="15840"/>

</xml_diff>